<commit_message>
add course survey data
</commit_message>
<xml_diff>
--- a/VGDS/VGDS-G/paper.docx
+++ b/VGDS/VGDS-G/paper.docx
@@ -1,318 +1,7 @@
 
 <file path=word/document.xml><?xml version="1.0" encoding="utf-8"?>
-<w:document xmlns:wpc="http://schemas.microsoft.com/office/word/2010/wordprocessingCanvas" xmlns:mo="http://schemas.microsoft.com/office/mac/office/2008/main" xmlns:mc="http://schemas.openxmlformats.org/markup-compatibility/2006" xmlns:mv="urn:schemas-microsoft-com:mac:vml" xmlns:o="urn:schemas-microsoft-com:office:office" xmlns:r="http://schemas.openxmlformats.org/officeDocument/2006/relationships" xmlns:m="http://schemas.openxmlformats.org/officeDocument/2006/math" xmlns:v="urn:schemas-microsoft-com:vml" xmlns:wp14="http://schemas.microsoft.com/office/word/2010/wordprocessingDrawing" xmlns:wp="http://schemas.openxmlformats.org/drawingml/2006/wordprocessingDrawing" xmlns:w10="urn:schemas-microsoft-com:office:word" xmlns:w="http://schemas.openxmlformats.org/wordprocessingml/2006/main" xmlns:w14="http://schemas.microsoft.com/office/word/2010/wordml" xmlns:w15="http://schemas.microsoft.com/office/word/2012/wordml" xmlns:wpg="http://schemas.microsoft.com/office/word/2010/wordprocessingGroup" xmlns:wpi="http://schemas.microsoft.com/office/word/2010/wordprocessingInk" xmlns:wne="http://schemas.microsoft.com/office/word/2006/wordml" xmlns:wps="http://schemas.microsoft.com/office/word/2010/wordprocessingShape" mc:Ignorable="w14 w15 wp14">
+<w:document xmlns:wpc="http://schemas.microsoft.com/office/word/2010/wordprocessingCanvas" xmlns:cx="http://schemas.microsoft.com/office/drawing/2014/chartex" xmlns:cx1="http://schemas.microsoft.com/office/drawing/2015/9/8/chartex" xmlns:cx2="http://schemas.microsoft.com/office/drawing/2015/10/21/chartex" xmlns:cx3="http://schemas.microsoft.com/office/drawing/2016/5/9/chartex" xmlns:cx4="http://schemas.microsoft.com/office/drawing/2016/5/10/chartex" xmlns:cx5="http://schemas.microsoft.com/office/drawing/2016/5/11/chartex" xmlns:cx6="http://schemas.microsoft.com/office/drawing/2016/5/12/chartex" xmlns:cx7="http://schemas.microsoft.com/office/drawing/2016/5/13/chartex" xmlns:cx8="http://schemas.microsoft.com/office/drawing/2016/5/14/chartex" xmlns:mc="http://schemas.openxmlformats.org/markup-compatibility/2006" xmlns:aink="http://schemas.microsoft.com/office/drawing/2016/ink" xmlns:am3d="http://schemas.microsoft.com/office/drawing/2017/model3d" xmlns:o="urn:schemas-microsoft-com:office:office" xmlns:oel="http://schemas.microsoft.com/office/2019/extlst" xmlns:r="http://schemas.openxmlformats.org/officeDocument/2006/relationships" xmlns:m="http://schemas.openxmlformats.org/officeDocument/2006/math" xmlns:v="urn:schemas-microsoft-com:vml" xmlns:wp14="http://schemas.microsoft.com/office/word/2010/wordprocessingDrawing" xmlns:wp="http://schemas.openxmlformats.org/drawingml/2006/wordprocessingDrawing" xmlns:w10="urn:schemas-microsoft-com:office:word" xmlns:w="http://schemas.openxmlformats.org/wordprocessingml/2006/main" xmlns:w14="http://schemas.microsoft.com/office/word/2010/wordml" xmlns:w15="http://schemas.microsoft.com/office/word/2012/wordml" xmlns:w16cex="http://schemas.microsoft.com/office/word/2018/wordml/cex" xmlns:w16cid="http://schemas.microsoft.com/office/word/2016/wordml/cid" xmlns:w16="http://schemas.microsoft.com/office/word/2018/wordml" xmlns:w16du="http://schemas.microsoft.com/office/word/2023/wordml/word16du" xmlns:w16sdtdh="http://schemas.microsoft.com/office/word/2020/wordml/sdtdatahash" xmlns:w16sdtfl="http://schemas.microsoft.com/office/word/2024/wordml/sdtformatlock" xmlns:w16se="http://schemas.microsoft.com/office/word/2015/wordml/symex" xmlns:wpg="http://schemas.microsoft.com/office/word/2010/wordprocessingGroup" xmlns:wpi="http://schemas.microsoft.com/office/word/2010/wordprocessingInk" xmlns:wne="http://schemas.microsoft.com/office/word/2006/wordml" xmlns:wps="http://schemas.microsoft.com/office/word/2010/wordprocessingShape" mc:Ignorable="w14 w15 w16se w16cid w16 w16cex w16sdtdh w16sdtfl w16du wp14">
   <w:body>
-    <w:p>
-      <w:pPr>
-        <w:jc w:val="center"/>
-        <w:outlineLvl w:val="0"/>
-        <w:rPr>
-          <w:b/>
-          <w:lang w:val="en-US"/>
-        </w:rPr>
-      </w:pPr>
-      <w:r>
-        <w:rPr>
-          <w:b/>
-          <w:lang w:val="en-US"/>
-        </w:rPr>
-        <w:t>A German</w:t>
-      </w:r>
-      <w:r>
-        <w:rPr>
-          <w:b/>
-          <w:lang w:val="en-US"/>
-        </w:rPr>
-        <w:t>-language version</w:t>
-      </w:r>
-      <w:r>
-        <w:rPr>
-          <w:b/>
-          <w:lang w:val="en-US"/>
-        </w:rPr>
-        <w:t xml:space="preserve"> of the Video Game Demand Scale</w:t>
-      </w:r>
-      <w:r>
-        <w:rPr>
-          <w:b/>
-          <w:lang w:val="en-US"/>
-        </w:rPr>
-        <w:t xml:space="preserve"> (VGDS-G)</w:t>
-      </w:r>
-      <w:r>
-        <w:rPr>
-          <w:b/>
-          <w:lang w:val="en"/>
-        </w:rPr>
-        <w:t>: Development, measurement invariance, and (replicated) factorial validity</w:t>
-      </w:r>
-    </w:p>
-    <w:p>
-      <w:pPr>
-        <w:jc w:val="center"/>
-        <w:rPr>
-          <w:lang w:val="en-US"/>
-        </w:rPr>
-      </w:pPr>
-    </w:p>
-    <w:p>
-      <w:pPr>
-        <w:jc w:val="center"/>
-        <w:rPr>
-          <w:lang w:val="en-US"/>
-        </w:rPr>
-      </w:pPr>
-      <w:r>
-        <w:rPr>
-          <w:lang w:val="en-US"/>
-        </w:rPr>
-        <w:t>[Authors removed for anonymous review]</w:t>
-      </w:r>
-    </w:p>
-    <w:p>
-      <w:pPr>
-        <w:jc w:val="center"/>
-        <w:rPr>
-          <w:lang w:val="en-US"/>
-        </w:rPr>
-      </w:pPr>
-    </w:p>
-    <w:p>
-      <w:pPr>
-        <w:rPr>
-          <w:lang w:val="en-US"/>
-        </w:rPr>
-      </w:pPr>
-      <w:r>
-        <w:rPr>
-          <w:b/>
-          <w:lang w:val="en-US"/>
-        </w:rPr>
-        <w:t xml:space="preserve">Abstract: </w:t>
-      </w:r>
-      <w:r>
-        <w:rPr>
-          <w:lang w:val="en-US"/>
-        </w:rPr>
-        <w:t>The Video Game Demand Scale (VGDS) is a 26-item, five-factor scale designed to assess the cognitive, emotional, physical and social demands</w:t>
-      </w:r>
-      <w:r>
-        <w:rPr>
-          <w:lang w:val="en-US"/>
-        </w:rPr>
-        <w:t xml:space="preserve"> experienced by video game players</w:t>
-      </w:r>
-      <w:r>
-        <w:rPr>
-          <w:lang w:val="en-US"/>
-        </w:rPr>
-        <w:t>. Given the popularity of video games</w:t>
-      </w:r>
-      <w:r>
-        <w:rPr>
-          <w:lang w:val="en-US"/>
-        </w:rPr>
-        <w:t xml:space="preserve">, </w:t>
-      </w:r>
-      <w:r>
-        <w:rPr>
-          <w:lang w:val="en-US"/>
-        </w:rPr>
-        <w:t xml:space="preserve">as well as game studies research </w:t>
-      </w:r>
-      <w:r>
-        <w:rPr>
-          <w:lang w:val="en-US"/>
-        </w:rPr>
-        <w:t xml:space="preserve">in </w:t>
-      </w:r>
-      <w:r>
-        <w:rPr>
-          <w:lang w:val="en-US"/>
-        </w:rPr>
-        <w:t>German</w:t>
-      </w:r>
-      <w:r>
-        <w:rPr>
-          <w:lang w:val="en-US"/>
-        </w:rPr>
-        <w:t>y</w:t>
-      </w:r>
-      <w:r>
-        <w:rPr>
-          <w:lang w:val="en-US"/>
-        </w:rPr>
-        <w:t xml:space="preserve">, </w:t>
-      </w:r>
-      <w:r>
-        <w:rPr>
-          <w:lang w:val="en-US"/>
-        </w:rPr>
-        <w:t xml:space="preserve">the current study introduces </w:t>
-      </w:r>
-      <w:r>
-        <w:rPr>
-          <w:lang w:val="en-US"/>
-        </w:rPr>
-        <w:t>a German-</w:t>
-      </w:r>
-      <w:r>
-        <w:rPr>
-          <w:lang w:val="en-US"/>
-        </w:rPr>
-        <w:t>language</w:t>
-      </w:r>
-      <w:r>
-        <w:rPr>
-          <w:lang w:val="en-US"/>
-        </w:rPr>
-        <w:t xml:space="preserve"> </w:t>
-      </w:r>
-      <w:r>
-        <w:rPr>
-          <w:lang w:val="en-US"/>
-        </w:rPr>
-        <w:t>VGDS</w:t>
-      </w:r>
-      <w:r>
-        <w:rPr>
-          <w:lang w:val="en-US"/>
-        </w:rPr>
-        <w:t xml:space="preserve"> (VGDS-G)</w:t>
-      </w:r>
-      <w:r>
-        <w:rPr>
-          <w:lang w:val="en-US"/>
-        </w:rPr>
-        <w:t xml:space="preserve">. </w:t>
-      </w:r>
-      <w:r>
-        <w:rPr>
-          <w:rStyle w:val="normaltextrun"/>
-          <w:color w:val="000000"/>
-          <w:shd w:val="clear" w:color="auto" w:fill="FFFFFF"/>
-          <w:lang w:val="en-US"/>
-        </w:rPr>
-        <w:t xml:space="preserve">The translated scale replicated the original version with exception of a single item, demonstrating configural and partial metric measurement invariance when compared with freely available data from the VGDS. </w:t>
-      </w:r>
-      <w:r>
-        <w:rPr>
-          <w:lang w:val="en-US"/>
-        </w:rPr>
-        <w:t>Moreover, p</w:t>
-      </w:r>
-      <w:r>
-        <w:rPr>
-          <w:lang w:val="en-US"/>
-        </w:rPr>
-        <w:t xml:space="preserve">redictive, convergent, and concurrent validity tests between </w:t>
-      </w:r>
-      <w:r>
-        <w:rPr>
-          <w:lang w:val="en-US"/>
-        </w:rPr>
-        <w:t xml:space="preserve">the </w:t>
-      </w:r>
-      <w:r>
-        <w:rPr>
-          <w:lang w:val="en-US"/>
-        </w:rPr>
-        <w:t>VGDS-G</w:t>
-      </w:r>
-      <w:r>
-        <w:rPr>
-          <w:lang w:val="en-US"/>
-        </w:rPr>
-        <w:t xml:space="preserve"> and common measures of task load, entertainment, need satisfaction, and game ratings </w:t>
-      </w:r>
-      <w:r>
-        <w:rPr>
-          <w:lang w:val="en-US"/>
-        </w:rPr>
-        <w:t xml:space="preserve">(replications of </w:t>
-      </w:r>
-      <w:r>
-        <w:rPr>
-          <w:lang w:val="en-US"/>
-        </w:rPr>
-        <w:t xml:space="preserve">the original VGDS validity tests) </w:t>
-      </w:r>
-      <w:r>
-        <w:rPr>
-          <w:lang w:val="en-US"/>
-        </w:rPr>
-        <w:t>provide further evidence of (a) the translated scale’s quality and (b) further validation of an interactivity-as-demand approach to studying video games.</w:t>
-      </w:r>
-      <w:r>
-        <w:rPr>
-          <w:lang w:val="en-US"/>
-        </w:rPr>
-        <w:t xml:space="preserve"> For scholars interested </w:t>
-      </w:r>
-      <w:r>
-        <w:rPr>
-          <w:lang w:val="en-US"/>
-        </w:rPr>
-        <w:t xml:space="preserve">in how </w:t>
-      </w:r>
-      <w:r>
-        <w:rPr>
-          <w:lang w:val="en-US"/>
-        </w:rPr>
-        <w:t>video game players experience intera</w:t>
-      </w:r>
-      <w:r>
-        <w:rPr>
-          <w:lang w:val="en-US"/>
-        </w:rPr>
-        <w:t>ctivity in video games on multiple dimensions</w:t>
-      </w:r>
-      <w:r>
-        <w:rPr>
-          <w:lang w:val="en-US"/>
-        </w:rPr>
-        <w:t>, as well as how these demand perceptions influence myriad gaming outcomes</w:t>
-      </w:r>
-      <w:r>
-        <w:rPr>
-          <w:lang w:val="en-US"/>
-        </w:rPr>
-        <w:t xml:space="preserve">, VGDS and VGDS-G emerge as useful </w:t>
-      </w:r>
-      <w:r>
-        <w:rPr>
-          <w:lang w:val="en-US"/>
-        </w:rPr>
-        <w:t xml:space="preserve">and reliable self-report metrics. </w:t>
-      </w:r>
-    </w:p>
-    <w:p>
-      <w:pPr>
-        <w:rPr>
-          <w:lang w:val="en-US"/>
-        </w:rPr>
-      </w:pPr>
-    </w:p>
-    <w:p>
-      <w:pPr>
-        <w:rPr>
-          <w:lang w:val="en-US"/>
-        </w:rPr>
-      </w:pPr>
-      <w:r>
-        <w:rPr>
-          <w:i/>
-          <w:lang w:val="en-US"/>
-        </w:rPr>
-        <w:t>Keywords: Video Game Demand Scale, scale translation, scale validation, media entertainment</w:t>
-      </w:r>
-      <w:r>
-        <w:rPr>
-          <w:lang w:val="en-US"/>
-        </w:rPr>
-        <w:br w:type="page"/>
-      </w:r>
-    </w:p>
     <w:p>
       <w:pPr>
         <w:spacing w:line="480" w:lineRule="auto"/>
@@ -328,7 +17,6 @@
           <w:b/>
           <w:lang w:val="en-US"/>
         </w:rPr>
-        <w:lastRenderedPageBreak/>
         <w:t>A German</w:t>
       </w:r>
       <w:r>
@@ -645,21 +333,7 @@
         <w:rPr>
           <w:lang w:val="en-US"/>
         </w:rPr>
-        <w:t xml:space="preserve">) and a self-report measurement model was proposed: </w:t>
-      </w:r>
-      <w:proofErr w:type="gramStart"/>
-      <w:r>
-        <w:rPr>
-          <w:lang w:val="en-US"/>
-        </w:rPr>
-        <w:t>the</w:t>
-      </w:r>
-      <w:proofErr w:type="gramEnd"/>
-      <w:r>
-        <w:rPr>
-          <w:lang w:val="en-US"/>
-        </w:rPr>
-        <w:t xml:space="preserve"> </w:t>
+        <w:t xml:space="preserve">) and a self-report measurement model was proposed: the </w:t>
       </w:r>
       <w:r>
         <w:rPr>
@@ -1647,7 +1321,7 @@
       </w:r>
       <w:r>
         <w:rPr>
-          <w:rStyle w:val="Funotenzeichen"/>
+          <w:rStyle w:val="FootnoteReference"/>
         </w:rPr>
         <w:footnoteReference w:id="2"/>
       </w:r>
@@ -1738,7 +1412,7 @@
       <w:hyperlink r:id="rId8" w:history="1">
         <w:r>
           <w:rPr>
-            <w:rStyle w:val="Link"/>
+            <w:rStyle w:val="Hyperlink"/>
             <w:lang w:val="en-US"/>
           </w:rPr>
           <w:t>https://osf.io/dr54t/?view_only=e7520417c83b4170a5d22ddca41ec249</w:t>
@@ -2974,21 +2648,7 @@
         <w:rPr>
           <w:lang w:val="en-US"/>
         </w:rPr>
-        <w:t xml:space="preserve"> the player need satisfaction scale (PENS). PENS </w:t>
-      </w:r>
-      <w:proofErr w:type="gramStart"/>
-      <w:r>
-        <w:rPr>
-          <w:lang w:val="en-US"/>
-        </w:rPr>
-        <w:t>consists</w:t>
-      </w:r>
-      <w:proofErr w:type="gramEnd"/>
-      <w:r>
-        <w:rPr>
-          <w:lang w:val="en-US"/>
-        </w:rPr>
-        <w:t xml:space="preserve"> of </w:t>
+        <w:t xml:space="preserve"> the player need satisfaction scale (PENS). PENS consists of </w:t>
       </w:r>
       <w:r>
         <w:rPr>
@@ -4284,7 +3944,7 @@
       <w:hyperlink r:id="rId9" w:history="1">
         <w:r>
           <w:rPr>
-            <w:rStyle w:val="Link"/>
+            <w:rStyle w:val="Hyperlink"/>
             <w:lang w:val="en-US"/>
           </w:rPr>
           <w:t>https://osf.io/x5jch/</w:t>
@@ -4749,7 +4409,7 @@
       </w:r>
       <w:r>
         <w:rPr>
-          <w:rStyle w:val="Funotenzeichen"/>
+          <w:rStyle w:val="FootnoteReference"/>
           <w:color w:val="000000" w:themeColor="text1"/>
         </w:rPr>
         <w:footnoteReference w:id="3"/>
@@ -6622,15 +6282,7 @@
         <w:rPr>
           <w:lang w:val="en-US"/>
         </w:rPr>
-        <w:t>ontr</w:t>
-      </w:r>
-      <w:bookmarkStart w:id="0" w:name="_GoBack"/>
-      <w:bookmarkEnd w:id="0"/>
-      <w:r>
-        <w:rPr>
-          <w:lang w:val="en-US"/>
-        </w:rPr>
-        <w:t>oller demand was unrelated to any effort</w:t>
+        <w:t>ontroller demand was unrelated to any effort</w:t>
       </w:r>
       <w:r>
         <w:rPr>
@@ -7166,7 +6818,7 @@
       <w:hyperlink r:id="rId10" w:history="1">
         <w:r>
           <w:rPr>
-            <w:rStyle w:val="Link"/>
+            <w:rStyle w:val="Hyperlink"/>
             <w:rFonts w:eastAsia="Times New Roman"/>
             <w:lang w:val="en-US"/>
           </w:rPr>
@@ -7248,7 +6900,7 @@
       <w:hyperlink r:id="rId11" w:history="1">
         <w:r>
           <w:rPr>
-            <w:rStyle w:val="Link"/>
+            <w:rStyle w:val="Hyperlink"/>
             <w:rFonts w:eastAsia="Times New Roman"/>
             <w:lang w:val="en-US"/>
           </w:rPr>
@@ -7383,7 +7035,7 @@
       <w:hyperlink r:id="rId12" w:history="1">
         <w:r>
           <w:rPr>
-            <w:rStyle w:val="Link"/>
+            <w:rStyle w:val="Hyperlink"/>
             <w:lang w:val="en-US"/>
           </w:rPr>
           <w:t>https://doi.org/10.1080/08824096.2016.1250070</w:t>
@@ -7442,21 +7094,7 @@
         <w:rPr>
           <w:lang w:val="en-US"/>
         </w:rPr>
-        <w:t xml:space="preserve">Hart, S. G., &amp; Staveland, L. E. (1988). Development of NASA-TLX (task load index): Results of empirical and theoretical research. In P. A. Hancock &amp; N. </w:t>
-      </w:r>
-      <w:proofErr w:type="spellStart"/>
-      <w:r>
-        <w:rPr>
-          <w:lang w:val="en-US"/>
-        </w:rPr>
-        <w:t>Meshkati</w:t>
-      </w:r>
-      <w:proofErr w:type="spellEnd"/>
-      <w:r>
-        <w:rPr>
-          <w:lang w:val="en-US"/>
-        </w:rPr>
-        <w:t xml:space="preserve"> (Eds.), Human mental workload (pp. 139–183). </w:t>
+        <w:t xml:space="preserve">Hart, S. G., &amp; Staveland, L. E. (1988). Development of NASA-TLX (task load index): Results of empirical and theoretical research. In P. A. Hancock &amp; N. Meshkati (Eds.), Human mental workload (pp. 139–183). </w:t>
       </w:r>
       <w:r>
         <w:rPr>
@@ -7470,7 +7108,7 @@
         <w:spacing w:line="480" w:lineRule="auto"/>
         <w:ind w:left="720" w:hanging="720"/>
         <w:rPr>
-          <w:rStyle w:val="Link"/>
+          <w:rStyle w:val="Hyperlink"/>
           <w:lang w:val="en-US"/>
         </w:rPr>
       </w:pPr>
@@ -7514,7 +7152,7 @@
       <w:hyperlink r:id="rId13" w:history="1">
         <w:r>
           <w:rPr>
-            <w:rStyle w:val="Link"/>
+            <w:rStyle w:val="Hyperlink"/>
             <w:lang w:val="en-US"/>
           </w:rPr>
           <w:t>https://doi.org/10.1080/23808985.2018.1442239</w:t>
@@ -7555,7 +7193,7 @@
       <w:hyperlink r:id="rId14" w:history="1">
         <w:r>
           <w:rPr>
-            <w:rStyle w:val="Link"/>
+            <w:rStyle w:val="Hyperlink"/>
             <w:rFonts w:eastAsia="Times New Roman"/>
             <w:lang w:val="en-US"/>
           </w:rPr>
@@ -7611,23 +7249,7 @@
           <w:rFonts w:eastAsia="Times New Roman"/>
           <w:lang w:val="en-US"/>
         </w:rPr>
-        <w:t xml:space="preserve">Kahn, A. S., Shen, C., Lu, L., Ratan, R. A., </w:t>
-      </w:r>
-      <w:proofErr w:type="spellStart"/>
-      <w:r>
-        <w:rPr>
-          <w:rFonts w:eastAsia="Times New Roman"/>
-          <w:lang w:val="en-US"/>
-        </w:rPr>
-        <w:t>Coary</w:t>
-      </w:r>
-      <w:proofErr w:type="spellEnd"/>
-      <w:r>
-        <w:rPr>
-          <w:rFonts w:eastAsia="Times New Roman"/>
-          <w:lang w:val="en-US"/>
-        </w:rPr>
-        <w:t xml:space="preserve">, S., Hou, J., … </w:t>
+        <w:t xml:space="preserve">Kahn, A. S., Shen, C., Lu, L., Ratan, R. A., Coary, S., Hou, J., … </w:t>
       </w:r>
       <w:r>
         <w:rPr>
@@ -7683,7 +7305,7 @@
       <w:hyperlink r:id="rId15" w:tgtFrame="_blank" w:tooltip="Persistent link using digital object identifier" w:history="1">
         <w:r>
           <w:rPr>
-            <w:rStyle w:val="Link"/>
+            <w:rStyle w:val="Hyperlink"/>
             <w:rFonts w:eastAsia="Times New Roman"/>
             <w:lang w:val="en-US"/>
           </w:rPr>
@@ -7727,14 +7349,14 @@
       <w:hyperlink r:id="rId16" w:history="1">
         <w:r>
           <w:rPr>
-            <w:rStyle w:val="Link"/>
+            <w:rStyle w:val="Hyperlink"/>
             <w:lang w:val="en-US"/>
           </w:rPr>
           <w:t>https://doi.org/</w:t>
         </w:r>
         <w:r>
           <w:rPr>
-            <w:rStyle w:val="Link"/>
+            <w:rStyle w:val="Hyperlink"/>
             <w:lang w:val="en-US"/>
           </w:rPr>
           <w:t>10.1037/ppm0000215</w:t>
@@ -7785,7 +7407,7 @@
       <w:hyperlink r:id="rId17" w:history="1">
         <w:r>
           <w:rPr>
-            <w:rStyle w:val="Link"/>
+            <w:rStyle w:val="Hyperlink"/>
             <w:lang w:val="en-US"/>
           </w:rPr>
           <w:t>https://cdn2.hubspot.net/hubfs/700740/Reports/Newzoo_2018_Global_Games_Market_Report_Light.pdf</w:t>
@@ -7835,7 +7457,7 @@
       <w:hyperlink r:id="rId18" w:history="1">
         <w:r>
           <w:rPr>
-            <w:rStyle w:val="Link"/>
+            <w:rStyle w:val="Hyperlink"/>
             <w:lang w:val="en-US"/>
           </w:rPr>
           <w:t>https://doi.org/10.1037/ppm0000066</w:t>
@@ -7885,7 +7507,7 @@
       <w:hyperlink r:id="rId19" w:history="1">
         <w:r>
           <w:rPr>
-            <w:rStyle w:val="Link"/>
+            <w:rStyle w:val="Hyperlink"/>
             <w:lang w:val="en-US"/>
           </w:rPr>
           <w:t>https://doi.org/10.1037/0022-0663.84.4.429</w:t>
@@ -7986,7 +7608,7 @@
       <w:hyperlink r:id="rId20" w:history="1">
         <w:r>
           <w:rPr>
-            <w:rStyle w:val="Link"/>
+            <w:rStyle w:val="Hyperlink"/>
             <w:lang w:val="en-US"/>
           </w:rPr>
           <w:t>https://doi.org/10.1162/pres.15.4.381</w:t>
@@ -8032,7 +7654,7 @@
       <w:hyperlink r:id="rId21" w:history="1">
         <w:r>
           <w:rPr>
-            <w:rStyle w:val="Link"/>
+            <w:rStyle w:val="Hyperlink"/>
             <w:lang w:val="en-US"/>
           </w:rPr>
           <w:t>https://doi.org/10.1016/j.chb.2014.07.037</w:t>
@@ -8100,7 +7722,7 @@
       <w:hyperlink r:id="rId22" w:history="1">
         <w:r>
           <w:rPr>
-            <w:rStyle w:val="Link"/>
+            <w:rStyle w:val="Hyperlink"/>
             <w:lang w:val="en-US"/>
           </w:rPr>
           <w:t>https://doi.org/10.1016/j.chb.2015.03.027</w:t>
@@ -8156,7 +7778,7 @@
       <w:hyperlink r:id="rId23" w:history="1">
         <w:r>
           <w:rPr>
-            <w:rStyle w:val="Link"/>
+            <w:rStyle w:val="Hyperlink"/>
             <w:lang w:val="en-US"/>
           </w:rPr>
           <w:t>http://www.jstatsoft.org/v48/i02/</w:t>
@@ -8206,7 +7828,7 @@
       <w:hyperlink r:id="rId24" w:history="1">
         <w:r>
           <w:rPr>
-            <w:rStyle w:val="Link"/>
+            <w:rStyle w:val="Hyperlink"/>
             <w:lang w:val="en-US"/>
           </w:rPr>
           <w:t>https://doi.org/10.1007/s11031-006-9051-8</w:t>
@@ -8261,7 +7883,7 @@
       <w:hyperlink r:id="rId25" w:history="1">
         <w:r>
           <w:rPr>
-            <w:rStyle w:val="Link"/>
+            <w:rStyle w:val="Hyperlink"/>
             <w:lang w:val="en-US"/>
           </w:rPr>
           <w:t>https://doi.org/10.1027/1864-1105/a000236</w:t>
@@ -8273,7 +7895,7 @@
         <w:spacing w:line="480" w:lineRule="auto"/>
         <w:ind w:left="720" w:hanging="720"/>
         <w:rPr>
-          <w:rStyle w:val="Link"/>
+          <w:rStyle w:val="Hyperlink"/>
           <w:rFonts w:eastAsia="Times New Roman"/>
           <w:lang w:val="en-US"/>
         </w:rPr>
@@ -8317,7 +7939,7 @@
       <w:hyperlink r:id="rId26" w:history="1">
         <w:r>
           <w:rPr>
-            <w:rStyle w:val="Link"/>
+            <w:rStyle w:val="Hyperlink"/>
             <w:rFonts w:eastAsia="Times New Roman"/>
             <w:lang w:val="en-US"/>
           </w:rPr>
@@ -8325,7 +7947,7 @@
         </w:r>
         <w:r>
           <w:rPr>
-            <w:rStyle w:val="Link"/>
+            <w:rStyle w:val="Hyperlink"/>
             <w:rFonts w:eastAsia="Times New Roman"/>
             <w:lang w:val="en-US"/>
           </w:rPr>
@@ -8384,7 +8006,7 @@
       <w:hyperlink r:id="rId27" w:history="1">
         <w:r>
           <w:rPr>
-            <w:rStyle w:val="Link"/>
+            <w:rStyle w:val="Hyperlink"/>
             <w:rFonts w:eastAsia="Times New Roman"/>
             <w:lang w:val="en-US"/>
           </w:rPr>
@@ -8403,24 +8025,8 @@
 </w:document>
 </file>
 
-<file path=word/commentsIds.xml><?xml version="1.0" encoding="utf-8"?>
-<w16cid:commentsIds xmlns:wpc="http://schemas.microsoft.com/office/word/2010/wordprocessingCanvas" xmlns:cx="http://schemas.microsoft.com/office/drawing/2014/chartex" xmlns:cx1="http://schemas.microsoft.com/office/drawing/2015/9/8/chartex" xmlns:cx2="http://schemas.microsoft.com/office/drawing/2015/10/21/chartex" xmlns:cx3="http://schemas.microsoft.com/office/drawing/2016/5/9/chartex" xmlns:cx4="http://schemas.microsoft.com/office/drawing/2016/5/10/chartex" xmlns:cx5="http://schemas.microsoft.com/office/drawing/2016/5/11/chartex" xmlns:cx6="http://schemas.microsoft.com/office/drawing/2016/5/12/chartex" xmlns:cx7="http://schemas.microsoft.com/office/drawing/2016/5/13/chartex" xmlns:cx8="http://schemas.microsoft.com/office/drawing/2016/5/14/chartex" xmlns:mc="http://schemas.openxmlformats.org/markup-compatibility/2006" xmlns:aink="http://schemas.microsoft.com/office/drawing/2016/ink" xmlns:am3d="http://schemas.microsoft.com/office/drawing/2017/model3d" xmlns:o="urn:schemas-microsoft-com:office:office" xmlns:r="http://schemas.openxmlformats.org/officeDocument/2006/relationships" xmlns:m="http://schemas.openxmlformats.org/officeDocument/2006/math" xmlns:v="urn:schemas-microsoft-com:vml" xmlns:wp14="http://schemas.microsoft.com/office/word/2010/wordprocessingDrawing" xmlns:wp="http://schemas.openxmlformats.org/drawingml/2006/wordprocessingDrawing" xmlns:w10="urn:schemas-microsoft-com:office:word" xmlns:w="http://schemas.openxmlformats.org/wordprocessingml/2006/main" xmlns:w14="http://schemas.microsoft.com/office/word/2010/wordml" xmlns:w15="http://schemas.microsoft.com/office/word/2012/wordml" xmlns:w16cid="http://schemas.microsoft.com/office/word/2016/wordml/cid" xmlns:w16se="http://schemas.microsoft.com/office/word/2015/wordml/symex" xmlns:wpg="http://schemas.microsoft.com/office/word/2010/wordprocessingGroup" xmlns:wpi="http://schemas.microsoft.com/office/word/2010/wordprocessingInk" xmlns:wne="http://schemas.microsoft.com/office/word/2006/wordml" xmlns:wps="http://schemas.microsoft.com/office/word/2010/wordprocessingShape" mc:Ignorable="w14 w15 w16se w16cid wp14">
-  <w16cid:commentId w16cid:paraId="44368C0A" w16cid:durableId="20C70B8C"/>
-  <w16cid:commentId w16cid:paraId="538D137C" w16cid:durableId="6EEC0BFB"/>
-  <w16cid:commentId w16cid:paraId="4ABC89A7" w16cid:durableId="20C7379C"/>
-  <w16cid:commentId w16cid:paraId="7A7C0DD6" w16cid:durableId="20C858B6"/>
-  <w16cid:commentId w16cid:paraId="28B436D1" w16cid:durableId="20C73775"/>
-  <w16cid:commentId w16cid:paraId="15E0B5E6" w16cid:durableId="20C858B8"/>
-  <w16cid:commentId w16cid:paraId="1505B3A3" w16cid:durableId="20BA6E0D"/>
-  <w16cid:commentId w16cid:paraId="6670F1FB" w16cid:durableId="20C5D9D1"/>
-  <w16cid:commentId w16cid:paraId="6F10DE00" w16cid:durableId="20C858BB"/>
-  <w16cid:commentId w16cid:paraId="433059AB" w16cid:durableId="20C5D476"/>
-  <w16cid:commentId w16cid:paraId="17359054" w16cid:durableId="20C5DC17"/>
-</w16cid:commentsIds>
-</file>
-
 <file path=word/endnotes.xml><?xml version="1.0" encoding="utf-8"?>
-<w:endnotes xmlns:wpc="http://schemas.microsoft.com/office/word/2010/wordprocessingCanvas" xmlns:mo="http://schemas.microsoft.com/office/mac/office/2008/main" xmlns:mc="http://schemas.openxmlformats.org/markup-compatibility/2006" xmlns:mv="urn:schemas-microsoft-com:mac:vml" xmlns:o="urn:schemas-microsoft-com:office:office" xmlns:r="http://schemas.openxmlformats.org/officeDocument/2006/relationships" xmlns:m="http://schemas.openxmlformats.org/officeDocument/2006/math" xmlns:v="urn:schemas-microsoft-com:vml" xmlns:wp14="http://schemas.microsoft.com/office/word/2010/wordprocessingDrawing" xmlns:wp="http://schemas.openxmlformats.org/drawingml/2006/wordprocessingDrawing" xmlns:w10="urn:schemas-microsoft-com:office:word" xmlns:w="http://schemas.openxmlformats.org/wordprocessingml/2006/main" xmlns:w14="http://schemas.microsoft.com/office/word/2010/wordml" xmlns:w15="http://schemas.microsoft.com/office/word/2012/wordml" xmlns:wpg="http://schemas.microsoft.com/office/word/2010/wordprocessingGroup" xmlns:wpi="http://schemas.microsoft.com/office/word/2010/wordprocessingInk" xmlns:wne="http://schemas.microsoft.com/office/word/2006/wordml" xmlns:wps="http://schemas.microsoft.com/office/word/2010/wordprocessingShape" mc:Ignorable="w14 w15 wp14">
+<w:endnotes xmlns:wpc="http://schemas.microsoft.com/office/word/2010/wordprocessingCanvas" xmlns:cx="http://schemas.microsoft.com/office/drawing/2014/chartex" xmlns:cx1="http://schemas.microsoft.com/office/drawing/2015/9/8/chartex" xmlns:cx2="http://schemas.microsoft.com/office/drawing/2015/10/21/chartex" xmlns:cx3="http://schemas.microsoft.com/office/drawing/2016/5/9/chartex" xmlns:cx4="http://schemas.microsoft.com/office/drawing/2016/5/10/chartex" xmlns:cx5="http://schemas.microsoft.com/office/drawing/2016/5/11/chartex" xmlns:cx6="http://schemas.microsoft.com/office/drawing/2016/5/12/chartex" xmlns:cx7="http://schemas.microsoft.com/office/drawing/2016/5/13/chartex" xmlns:cx8="http://schemas.microsoft.com/office/drawing/2016/5/14/chartex" xmlns:mc="http://schemas.openxmlformats.org/markup-compatibility/2006" xmlns:aink="http://schemas.microsoft.com/office/drawing/2016/ink" xmlns:am3d="http://schemas.microsoft.com/office/drawing/2017/model3d" xmlns:o="urn:schemas-microsoft-com:office:office" xmlns:oel="http://schemas.microsoft.com/office/2019/extlst" xmlns:r="http://schemas.openxmlformats.org/officeDocument/2006/relationships" xmlns:m="http://schemas.openxmlformats.org/officeDocument/2006/math" xmlns:v="urn:schemas-microsoft-com:vml" xmlns:wp14="http://schemas.microsoft.com/office/word/2010/wordprocessingDrawing" xmlns:wp="http://schemas.openxmlformats.org/drawingml/2006/wordprocessingDrawing" xmlns:w10="urn:schemas-microsoft-com:office:word" xmlns:w="http://schemas.openxmlformats.org/wordprocessingml/2006/main" xmlns:w14="http://schemas.microsoft.com/office/word/2010/wordml" xmlns:w15="http://schemas.microsoft.com/office/word/2012/wordml" xmlns:w16cex="http://schemas.microsoft.com/office/word/2018/wordml/cex" xmlns:w16cid="http://schemas.microsoft.com/office/word/2016/wordml/cid" xmlns:w16="http://schemas.microsoft.com/office/word/2018/wordml" xmlns:w16du="http://schemas.microsoft.com/office/word/2023/wordml/word16du" xmlns:w16sdtdh="http://schemas.microsoft.com/office/word/2020/wordml/sdtdatahash" xmlns:w16sdtfl="http://schemas.microsoft.com/office/word/2024/wordml/sdtformatlock" xmlns:w16se="http://schemas.microsoft.com/office/word/2015/wordml/symex" xmlns:wpg="http://schemas.microsoft.com/office/word/2010/wordprocessingGroup" xmlns:wpi="http://schemas.microsoft.com/office/word/2010/wordprocessingInk" xmlns:wne="http://schemas.microsoft.com/office/word/2006/wordml" xmlns:wps="http://schemas.microsoft.com/office/word/2010/wordprocessingShape" mc:Ignorable="w14 w15 w16se w16cid w16 w16cex w16sdtdh w16sdtfl w16du wp14">
   <w:endnote w:type="separator" w:id="-1">
     <w:p>
       <w:r>
@@ -8442,7 +8048,7 @@
 </file>
 
 <file path=word/footnotes.xml><?xml version="1.0" encoding="utf-8"?>
-<w:footnotes xmlns:wpc="http://schemas.microsoft.com/office/word/2010/wordprocessingCanvas" xmlns:mo="http://schemas.microsoft.com/office/mac/office/2008/main" xmlns:mc="http://schemas.openxmlformats.org/markup-compatibility/2006" xmlns:mv="urn:schemas-microsoft-com:mac:vml" xmlns:o="urn:schemas-microsoft-com:office:office" xmlns:r="http://schemas.openxmlformats.org/officeDocument/2006/relationships" xmlns:m="http://schemas.openxmlformats.org/officeDocument/2006/math" xmlns:v="urn:schemas-microsoft-com:vml" xmlns:wp14="http://schemas.microsoft.com/office/word/2010/wordprocessingDrawing" xmlns:wp="http://schemas.openxmlformats.org/drawingml/2006/wordprocessingDrawing" xmlns:w10="urn:schemas-microsoft-com:office:word" xmlns:w="http://schemas.openxmlformats.org/wordprocessingml/2006/main" xmlns:w14="http://schemas.microsoft.com/office/word/2010/wordml" xmlns:w15="http://schemas.microsoft.com/office/word/2012/wordml" xmlns:wpg="http://schemas.microsoft.com/office/word/2010/wordprocessingGroup" xmlns:wpi="http://schemas.microsoft.com/office/word/2010/wordprocessingInk" xmlns:wne="http://schemas.microsoft.com/office/word/2006/wordml" xmlns:wps="http://schemas.microsoft.com/office/word/2010/wordprocessingShape" mc:Ignorable="w14 w15 wp14">
+<w:footnotes xmlns:wpc="http://schemas.microsoft.com/office/word/2010/wordprocessingCanvas" xmlns:cx="http://schemas.microsoft.com/office/drawing/2014/chartex" xmlns:cx1="http://schemas.microsoft.com/office/drawing/2015/9/8/chartex" xmlns:cx2="http://schemas.microsoft.com/office/drawing/2015/10/21/chartex" xmlns:cx3="http://schemas.microsoft.com/office/drawing/2016/5/9/chartex" xmlns:cx4="http://schemas.microsoft.com/office/drawing/2016/5/10/chartex" xmlns:cx5="http://schemas.microsoft.com/office/drawing/2016/5/11/chartex" xmlns:cx6="http://schemas.microsoft.com/office/drawing/2016/5/12/chartex" xmlns:cx7="http://schemas.microsoft.com/office/drawing/2016/5/13/chartex" xmlns:cx8="http://schemas.microsoft.com/office/drawing/2016/5/14/chartex" xmlns:mc="http://schemas.openxmlformats.org/markup-compatibility/2006" xmlns:aink="http://schemas.microsoft.com/office/drawing/2016/ink" xmlns:am3d="http://schemas.microsoft.com/office/drawing/2017/model3d" xmlns:o="urn:schemas-microsoft-com:office:office" xmlns:oel="http://schemas.microsoft.com/office/2019/extlst" xmlns:r="http://schemas.openxmlformats.org/officeDocument/2006/relationships" xmlns:m="http://schemas.openxmlformats.org/officeDocument/2006/math" xmlns:v="urn:schemas-microsoft-com:vml" xmlns:wp14="http://schemas.microsoft.com/office/word/2010/wordprocessingDrawing" xmlns:wp="http://schemas.openxmlformats.org/drawingml/2006/wordprocessingDrawing" xmlns:w10="urn:schemas-microsoft-com:office:word" xmlns:w="http://schemas.openxmlformats.org/wordprocessingml/2006/main" xmlns:w14="http://schemas.microsoft.com/office/word/2010/wordml" xmlns:w15="http://schemas.microsoft.com/office/word/2012/wordml" xmlns:w16cex="http://schemas.microsoft.com/office/word/2018/wordml/cex" xmlns:w16cid="http://schemas.microsoft.com/office/word/2016/wordml/cid" xmlns:w16="http://schemas.microsoft.com/office/word/2018/wordml" xmlns:w16du="http://schemas.microsoft.com/office/word/2023/wordml/word16du" xmlns:w16sdtdh="http://schemas.microsoft.com/office/word/2020/wordml/sdtdatahash" xmlns:w16sdtfl="http://schemas.microsoft.com/office/word/2024/wordml/sdtformatlock" xmlns:w16se="http://schemas.microsoft.com/office/word/2015/wordml/symex" xmlns:wpg="http://schemas.microsoft.com/office/word/2010/wordprocessingGroup" xmlns:wpi="http://schemas.microsoft.com/office/word/2010/wordprocessingInk" xmlns:wne="http://schemas.microsoft.com/office/word/2006/wordml" xmlns:wps="http://schemas.microsoft.com/office/word/2010/wordprocessingShape" mc:Ignorable="w14 w15 w16se w16cid w16 w16cex w16sdtdh w16sdtfl w16du wp14">
   <w:footnote w:type="separator" w:id="-1">
     <w:p>
       <w:r>
@@ -8463,7 +8069,7 @@
   <w:footnote w:id="2">
     <w:p>
       <w:pPr>
-        <w:pStyle w:val="Funotentext"/>
+        <w:pStyle w:val="FootnoteText"/>
         <w:rPr>
           <w:rFonts w:ascii="Times New Roman" w:hAnsi="Times New Roman" w:cs="Times New Roman"/>
           <w:lang w:val="en-US"/>
@@ -8471,7 +8077,7 @@
       </w:pPr>
       <w:r>
         <w:rPr>
-          <w:rStyle w:val="Funotenzeichen"/>
+          <w:rStyle w:val="FootnoteReference"/>
           <w:rFonts w:ascii="Times New Roman" w:hAnsi="Times New Roman" w:cs="Times New Roman"/>
         </w:rPr>
         <w:footnoteRef/>
@@ -8607,7 +8213,7 @@
   <w:footnote w:id="3">
     <w:p>
       <w:pPr>
-        <w:pStyle w:val="Funotentext"/>
+        <w:pStyle w:val="FootnoteText"/>
         <w:rPr>
           <w:rFonts w:ascii="Times New Roman" w:hAnsi="Times New Roman" w:cs="Times New Roman"/>
           <w:lang w:val="en-US"/>
@@ -8615,7 +8221,7 @@
       </w:pPr>
       <w:r>
         <w:rPr>
-          <w:rStyle w:val="Funotenzeichen"/>
+          <w:rStyle w:val="FootnoteReference"/>
           <w:rFonts w:ascii="Times New Roman" w:hAnsi="Times New Roman" w:cs="Times New Roman"/>
         </w:rPr>
         <w:footnoteRef/>
@@ -8631,12 +8237,6 @@
           <w:rFonts w:ascii="Times New Roman" w:hAnsi="Times New Roman" w:cs="Times New Roman"/>
         </w:rPr>
         <w:t xml:space="preserve">Detailed measurement invariance analyses illustrating model comparisons and procedures for estimating partially invariant models are available in the supplemental OSF space. </w:t>
-      </w:r>
-      <w:r>
-        <w:rPr>
-          <w:rFonts w:ascii="Times New Roman" w:hAnsi="Times New Roman" w:cs="Times New Roman"/>
-        </w:rPr>
-        <w:t/>
       </w:r>
     </w:p>
   </w:footnote>
@@ -8644,8 +8244,8 @@
 </file>
 
 <file path=word/numbering.xml><?xml version="1.0" encoding="utf-8"?>
-<w:numbering xmlns:wpc="http://schemas.microsoft.com/office/word/2010/wordprocessingCanvas" xmlns:mo="http://schemas.microsoft.com/office/mac/office/2008/main" xmlns:mc="http://schemas.openxmlformats.org/markup-compatibility/2006" xmlns:mv="urn:schemas-microsoft-com:mac:vml" xmlns:o="urn:schemas-microsoft-com:office:office" xmlns:r="http://schemas.openxmlformats.org/officeDocument/2006/relationships" xmlns:m="http://schemas.openxmlformats.org/officeDocument/2006/math" xmlns:v="urn:schemas-microsoft-com:vml" xmlns:wp14="http://schemas.microsoft.com/office/word/2010/wordprocessingDrawing" xmlns:wp="http://schemas.openxmlformats.org/drawingml/2006/wordprocessingDrawing" xmlns:w10="urn:schemas-microsoft-com:office:word" xmlns:w="http://schemas.openxmlformats.org/wordprocessingml/2006/main" xmlns:w14="http://schemas.microsoft.com/office/word/2010/wordml" xmlns:w15="http://schemas.microsoft.com/office/word/2012/wordml" xmlns:wpg="http://schemas.microsoft.com/office/word/2010/wordprocessingGroup" xmlns:wpi="http://schemas.microsoft.com/office/word/2010/wordprocessingInk" xmlns:wne="http://schemas.microsoft.com/office/word/2006/wordml" xmlns:wps="http://schemas.microsoft.com/office/word/2010/wordprocessingShape" mc:Ignorable="w14 w15 wp14">
-  <w:abstractNum w:abstractNumId="0">
+<w:numbering xmlns:wpc="http://schemas.microsoft.com/office/word/2010/wordprocessingCanvas" xmlns:cx="http://schemas.microsoft.com/office/drawing/2014/chartex" xmlns:cx1="http://schemas.microsoft.com/office/drawing/2015/9/8/chartex" xmlns:cx2="http://schemas.microsoft.com/office/drawing/2015/10/21/chartex" xmlns:cx3="http://schemas.microsoft.com/office/drawing/2016/5/9/chartex" xmlns:cx4="http://schemas.microsoft.com/office/drawing/2016/5/10/chartex" xmlns:cx5="http://schemas.microsoft.com/office/drawing/2016/5/11/chartex" xmlns:cx6="http://schemas.microsoft.com/office/drawing/2016/5/12/chartex" xmlns:cx7="http://schemas.microsoft.com/office/drawing/2016/5/13/chartex" xmlns:cx8="http://schemas.microsoft.com/office/drawing/2016/5/14/chartex" xmlns:mc="http://schemas.openxmlformats.org/markup-compatibility/2006" xmlns:aink="http://schemas.microsoft.com/office/drawing/2016/ink" xmlns:am3d="http://schemas.microsoft.com/office/drawing/2017/model3d" xmlns:o="urn:schemas-microsoft-com:office:office" xmlns:oel="http://schemas.microsoft.com/office/2019/extlst" xmlns:r="http://schemas.openxmlformats.org/officeDocument/2006/relationships" xmlns:m="http://schemas.openxmlformats.org/officeDocument/2006/math" xmlns:v="urn:schemas-microsoft-com:vml" xmlns:wp14="http://schemas.microsoft.com/office/word/2010/wordprocessingDrawing" xmlns:wp="http://schemas.openxmlformats.org/drawingml/2006/wordprocessingDrawing" xmlns:w10="urn:schemas-microsoft-com:office:word" xmlns:w="http://schemas.openxmlformats.org/wordprocessingml/2006/main" xmlns:w14="http://schemas.microsoft.com/office/word/2010/wordml" xmlns:w15="http://schemas.microsoft.com/office/word/2012/wordml" xmlns:w16cex="http://schemas.microsoft.com/office/word/2018/wordml/cex" xmlns:w16cid="http://schemas.microsoft.com/office/word/2016/wordml/cid" xmlns:w16="http://schemas.microsoft.com/office/word/2018/wordml" xmlns:w16du="http://schemas.microsoft.com/office/word/2023/wordml/word16du" xmlns:w16sdtdh="http://schemas.microsoft.com/office/word/2020/wordml/sdtdatahash" xmlns:w16sdtfl="http://schemas.microsoft.com/office/word/2024/wordml/sdtformatlock" xmlns:w16se="http://schemas.microsoft.com/office/word/2015/wordml/symex" xmlns:wpg="http://schemas.microsoft.com/office/word/2010/wordprocessingGroup" xmlns:wpi="http://schemas.microsoft.com/office/word/2010/wordprocessingInk" xmlns:wne="http://schemas.microsoft.com/office/word/2006/wordml" xmlns:wps="http://schemas.microsoft.com/office/word/2010/wordprocessingShape" mc:Ignorable="w14 w15 w16se w16cid w16 w16cex w16sdtdh w16sdtfl w16du wp14">
+  <w:abstractNum w:abstractNumId="0" w15:restartNumberingAfterBreak="0">
     <w:nsid w:val="0CCA4498"/>
     <w:multiLevelType w:val="hybridMultilevel"/>
     <w:tmpl w:val="26D07796"/>
@@ -8758,7 +8358,7 @@
       </w:rPr>
     </w:lvl>
   </w:abstractNum>
-  <w:abstractNum w:abstractNumId="1">
+  <w:abstractNum w:abstractNumId="1" w15:restartNumberingAfterBreak="0">
     <w:nsid w:val="13D221BB"/>
     <w:multiLevelType w:val="hybridMultilevel"/>
     <w:tmpl w:val="8E1C6DEC"/>
@@ -8871,7 +8471,7 @@
       </w:rPr>
     </w:lvl>
   </w:abstractNum>
-  <w:abstractNum w:abstractNumId="2">
+  <w:abstractNum w:abstractNumId="2" w15:restartNumberingAfterBreak="0">
     <w:nsid w:val="261F1E0A"/>
     <w:multiLevelType w:val="multilevel"/>
     <w:tmpl w:val="4DE26FBC"/>
@@ -9020,7 +8620,7 @@
       </w:rPr>
     </w:lvl>
   </w:abstractNum>
-  <w:abstractNum w:abstractNumId="3">
+  <w:abstractNum w:abstractNumId="3" w15:restartNumberingAfterBreak="0">
     <w:nsid w:val="36063436"/>
     <w:multiLevelType w:val="multilevel"/>
     <w:tmpl w:val="8BE67C6A"/>
@@ -9133,7 +8733,7 @@
       </w:rPr>
     </w:lvl>
   </w:abstractNum>
-  <w:abstractNum w:abstractNumId="4">
+  <w:abstractNum w:abstractNumId="4" w15:restartNumberingAfterBreak="0">
     <w:nsid w:val="46E7546E"/>
     <w:multiLevelType w:val="multilevel"/>
     <w:tmpl w:val="72AC8C2C"/>
@@ -9246,7 +8846,7 @@
       </w:rPr>
     </w:lvl>
   </w:abstractNum>
-  <w:abstractNum w:abstractNumId="5">
+  <w:abstractNum w:abstractNumId="5" w15:restartNumberingAfterBreak="0">
     <w:nsid w:val="4FEF43CB"/>
     <w:multiLevelType w:val="hybridMultilevel"/>
     <w:tmpl w:val="CDA4998A"/>
@@ -9335,7 +8935,7 @@
       </w:pPr>
     </w:lvl>
   </w:abstractNum>
-  <w:abstractNum w:abstractNumId="6">
+  <w:abstractNum w:abstractNumId="6" w15:restartNumberingAfterBreak="0">
     <w:nsid w:val="61F676B0"/>
     <w:multiLevelType w:val="hybridMultilevel"/>
     <w:tmpl w:val="3E6AEA30"/>
@@ -9421,7 +9021,7 @@
       </w:pPr>
     </w:lvl>
   </w:abstractNum>
-  <w:abstractNum w:abstractNumId="7">
+  <w:abstractNum w:abstractNumId="7" w15:restartNumberingAfterBreak="0">
     <w:nsid w:val="6B654D2C"/>
     <w:multiLevelType w:val="multilevel"/>
     <w:tmpl w:val="A9861A7A"/>
@@ -9570,7 +9170,7 @@
       </w:rPr>
     </w:lvl>
   </w:abstractNum>
-  <w:abstractNum w:abstractNumId="8">
+  <w:abstractNum w:abstractNumId="8" w15:restartNumberingAfterBreak="0">
     <w:nsid w:val="6E1B4443"/>
     <w:multiLevelType w:val="hybridMultilevel"/>
     <w:tmpl w:val="03B8109C"/>
@@ -9659,38 +9259,38 @@
       </w:pPr>
     </w:lvl>
   </w:abstractNum>
-  <w:num w:numId="1">
+  <w:num w:numId="1" w16cid:durableId="2024164790">
     <w:abstractNumId w:val="3"/>
   </w:num>
-  <w:num w:numId="2">
+  <w:num w:numId="2" w16cid:durableId="246306917">
     <w:abstractNumId w:val="4"/>
   </w:num>
-  <w:num w:numId="3">
+  <w:num w:numId="3" w16cid:durableId="1757021352">
     <w:abstractNumId w:val="6"/>
   </w:num>
-  <w:num w:numId="4">
+  <w:num w:numId="4" w16cid:durableId="317075213">
     <w:abstractNumId w:val="1"/>
   </w:num>
-  <w:num w:numId="5">
+  <w:num w:numId="5" w16cid:durableId="1857844066">
     <w:abstractNumId w:val="0"/>
   </w:num>
-  <w:num w:numId="6">
+  <w:num w:numId="6" w16cid:durableId="1437554561">
     <w:abstractNumId w:val="7"/>
   </w:num>
-  <w:num w:numId="7">
+  <w:num w:numId="7" w16cid:durableId="1339769518">
     <w:abstractNumId w:val="2"/>
   </w:num>
-  <w:num w:numId="8">
+  <w:num w:numId="8" w16cid:durableId="76175672">
     <w:abstractNumId w:val="8"/>
   </w:num>
-  <w:num w:numId="9">
+  <w:num w:numId="9" w16cid:durableId="1965849326">
     <w:abstractNumId w:val="5"/>
   </w:num>
 </w:numbering>
 </file>
 
 <file path=word/styles.xml><?xml version="1.0" encoding="utf-8"?>
-<w:styles xmlns:mc="http://schemas.openxmlformats.org/markup-compatibility/2006" xmlns:r="http://schemas.openxmlformats.org/officeDocument/2006/relationships" xmlns:w="http://schemas.openxmlformats.org/wordprocessingml/2006/main" xmlns:w14="http://schemas.microsoft.com/office/word/2010/wordml" xmlns:w15="http://schemas.microsoft.com/office/word/2012/wordml" mc:Ignorable="w14 w15">
+<w:styles xmlns:mc="http://schemas.openxmlformats.org/markup-compatibility/2006" xmlns:r="http://schemas.openxmlformats.org/officeDocument/2006/relationships" xmlns:w="http://schemas.openxmlformats.org/wordprocessingml/2006/main" xmlns:w14="http://schemas.microsoft.com/office/word/2010/wordml" xmlns:w15="http://schemas.microsoft.com/office/word/2012/wordml" xmlns:w16cex="http://schemas.microsoft.com/office/word/2018/wordml/cex" xmlns:w16cid="http://schemas.microsoft.com/office/word/2016/wordml/cid" xmlns:w16="http://schemas.microsoft.com/office/word/2018/wordml" xmlns:w16du="http://schemas.microsoft.com/office/word/2023/wordml/word16du" xmlns:w16sdtdh="http://schemas.microsoft.com/office/word/2020/wordml/sdtdatahash" xmlns:w16sdtfl="http://schemas.microsoft.com/office/word/2024/wordml/sdtformatlock" xmlns:w16se="http://schemas.microsoft.com/office/word/2015/wordml/symex" mc:Ignorable="w14 w15 w16se w16cid w16 w16cex w16sdtdh w16sdtfl w16du">
   <w:docDefaults>
     <w:rPrDefault>
       <w:rPr>
@@ -9707,7 +9307,7 @@
       </w:pPr>
     </w:pPrDefault>
   </w:docDefaults>
-  <w:latentStyles w:defLockedState="0" w:defUIPriority="99" w:defSemiHidden="0" w:defUnhideWhenUsed="0" w:defQFormat="0" w:count="382">
+  <w:latentStyles w:defLockedState="0" w:defUIPriority="99" w:defSemiHidden="0" w:defUnhideWhenUsed="0" w:defQFormat="0" w:count="376">
     <w:lsdException w:name="Normal" w:uiPriority="0" w:qFormat="1"/>
     <w:lsdException w:name="heading 1" w:uiPriority="0" w:qFormat="1"/>
     <w:lsdException w:name="heading 2" w:semiHidden="1" w:uiPriority="0" w:unhideWhenUsed="1" w:qFormat="1"/>
@@ -10082,7 +9682,7 @@
     <w:lsdException w:name="Mention" w:semiHidden="1" w:unhideWhenUsed="1"/>
     <w:lsdException w:name="Smart Hyperlink" w:semiHidden="1" w:unhideWhenUsed="1"/>
   </w:latentStyles>
-  <w:style w:type="paragraph" w:default="1" w:styleId="Standard">
+  <w:style w:type="paragraph" w:default="1" w:styleId="Normal">
     <w:name w:val="Normal"/>
     <w:qFormat/>
     <w:rsid w:val="008D19AA"/>
@@ -10097,10 +9697,10 @@
       <w:lang w:val="de-DE" w:eastAsia="de-DE"/>
     </w:rPr>
   </w:style>
-  <w:style w:type="paragraph" w:styleId="berschrift1">
+  <w:style w:type="paragraph" w:styleId="Heading1">
     <w:name w:val="heading 1"/>
-    <w:basedOn w:val="Standard"/>
-    <w:next w:val="Standard"/>
+    <w:basedOn w:val="Normal"/>
+    <w:next w:val="Normal"/>
     <w:pPr>
       <w:keepNext/>
       <w:keepLines/>
@@ -10115,10 +9715,10 @@
       <w:lang w:val="en" w:eastAsia="en-US"/>
     </w:rPr>
   </w:style>
-  <w:style w:type="paragraph" w:styleId="berschrift2">
+  <w:style w:type="paragraph" w:styleId="Heading2">
     <w:name w:val="heading 2"/>
-    <w:basedOn w:val="Standard"/>
-    <w:next w:val="Standard"/>
+    <w:basedOn w:val="Normal"/>
+    <w:next w:val="Normal"/>
     <w:pPr>
       <w:keepNext/>
       <w:keepLines/>
@@ -10133,10 +9733,10 @@
       <w:lang w:val="en" w:eastAsia="en-US"/>
     </w:rPr>
   </w:style>
-  <w:style w:type="paragraph" w:styleId="berschrift3">
+  <w:style w:type="paragraph" w:styleId="Heading3">
     <w:name w:val="heading 3"/>
-    <w:basedOn w:val="Standard"/>
-    <w:next w:val="Standard"/>
+    <w:basedOn w:val="Normal"/>
+    <w:next w:val="Normal"/>
     <w:pPr>
       <w:keepNext/>
       <w:keepLines/>
@@ -10152,10 +9752,10 @@
       <w:lang w:val="en" w:eastAsia="en-US"/>
     </w:rPr>
   </w:style>
-  <w:style w:type="paragraph" w:styleId="berschrift4">
+  <w:style w:type="paragraph" w:styleId="Heading4">
     <w:name w:val="heading 4"/>
-    <w:basedOn w:val="Standard"/>
-    <w:next w:val="Standard"/>
+    <w:basedOn w:val="Normal"/>
+    <w:next w:val="Normal"/>
     <w:pPr>
       <w:keepNext/>
       <w:keepLines/>
@@ -10169,10 +9769,10 @@
       <w:lang w:val="en" w:eastAsia="en-US"/>
     </w:rPr>
   </w:style>
-  <w:style w:type="paragraph" w:styleId="berschrift5">
+  <w:style w:type="paragraph" w:styleId="Heading5">
     <w:name w:val="heading 5"/>
-    <w:basedOn w:val="Standard"/>
-    <w:next w:val="Standard"/>
+    <w:basedOn w:val="Normal"/>
+    <w:next w:val="Normal"/>
     <w:pPr>
       <w:keepNext/>
       <w:keepLines/>
@@ -10188,10 +9788,10 @@
       <w:lang w:val="en" w:eastAsia="en-US"/>
     </w:rPr>
   </w:style>
-  <w:style w:type="paragraph" w:styleId="berschrift6">
+  <w:style w:type="paragraph" w:styleId="Heading6">
     <w:name w:val="heading 6"/>
-    <w:basedOn w:val="Standard"/>
-    <w:next w:val="Standard"/>
+    <w:basedOn w:val="Normal"/>
+    <w:next w:val="Normal"/>
     <w:pPr>
       <w:keepNext/>
       <w:keepLines/>
@@ -10208,13 +9808,13 @@
       <w:lang w:val="en" w:eastAsia="en-US"/>
     </w:rPr>
   </w:style>
-  <w:style w:type="character" w:default="1" w:styleId="Absatz-Standardschriftart">
+  <w:style w:type="character" w:default="1" w:styleId="DefaultParagraphFont">
     <w:name w:val="Default Paragraph Font"/>
     <w:uiPriority w:val="1"/>
     <w:semiHidden/>
     <w:unhideWhenUsed/>
   </w:style>
-  <w:style w:type="table" w:default="1" w:styleId="NormaleTabelle">
+  <w:style w:type="table" w:default="1" w:styleId="TableNormal">
     <w:name w:val="Normal Table"/>
     <w:uiPriority w:val="99"/>
     <w:semiHidden/>
@@ -10229,16 +9829,16 @@
       </w:tblCellMar>
     </w:tblPr>
   </w:style>
-  <w:style w:type="numbering" w:default="1" w:styleId="KeineListe">
+  <w:style w:type="numbering" w:default="1" w:styleId="NoList">
     <w:name w:val="No List"/>
     <w:uiPriority w:val="99"/>
     <w:semiHidden/>
     <w:unhideWhenUsed/>
   </w:style>
-  <w:style w:type="paragraph" w:styleId="Titel">
+  <w:style w:type="paragraph" w:styleId="Title">
     <w:name w:val="Title"/>
-    <w:basedOn w:val="Standard"/>
-    <w:next w:val="Standard"/>
+    <w:basedOn w:val="Normal"/>
+    <w:next w:val="Normal"/>
     <w:pPr>
       <w:keepNext/>
       <w:keepLines/>
@@ -10252,10 +9852,10 @@
       <w:lang w:val="en" w:eastAsia="en-US"/>
     </w:rPr>
   </w:style>
-  <w:style w:type="paragraph" w:styleId="Untertitel">
+  <w:style w:type="paragraph" w:styleId="Subtitle">
     <w:name w:val="Subtitle"/>
-    <w:basedOn w:val="Standard"/>
-    <w:next w:val="Standard"/>
+    <w:basedOn w:val="Normal"/>
+    <w:next w:val="Normal"/>
     <w:pPr>
       <w:keepNext/>
       <w:keepLines/>
@@ -10272,11 +9872,10 @@
   </w:style>
   <w:style w:type="table" w:customStyle="1" w:styleId="6">
     <w:name w:val="6"/>
-    <w:basedOn w:val="NormaleTabelle"/>
+    <w:basedOn w:val="TableNormal"/>
     <w:tblPr>
       <w:tblStyleRowBandSize w:val="1"/>
       <w:tblStyleColBandSize w:val="1"/>
-      <w:tblInd w:w="0" w:type="dxa"/>
       <w:tblCellMar>
         <w:top w:w="100" w:type="dxa"/>
         <w:left w:w="100" w:type="dxa"/>
@@ -10287,11 +9886,10 @@
   </w:style>
   <w:style w:type="table" w:customStyle="1" w:styleId="5">
     <w:name w:val="5"/>
-    <w:basedOn w:val="NormaleTabelle"/>
+    <w:basedOn w:val="TableNormal"/>
     <w:tblPr>
       <w:tblStyleRowBandSize w:val="1"/>
       <w:tblStyleColBandSize w:val="1"/>
-      <w:tblInd w:w="0" w:type="dxa"/>
       <w:tblCellMar>
         <w:top w:w="100" w:type="dxa"/>
         <w:left w:w="100" w:type="dxa"/>
@@ -10302,11 +9900,10 @@
   </w:style>
   <w:style w:type="table" w:customStyle="1" w:styleId="4">
     <w:name w:val="4"/>
-    <w:basedOn w:val="NormaleTabelle"/>
+    <w:basedOn w:val="TableNormal"/>
     <w:tblPr>
       <w:tblStyleRowBandSize w:val="1"/>
       <w:tblStyleColBandSize w:val="1"/>
-      <w:tblInd w:w="0" w:type="dxa"/>
       <w:tblCellMar>
         <w:top w:w="100" w:type="dxa"/>
         <w:left w:w="100" w:type="dxa"/>
@@ -10317,11 +9914,10 @@
   </w:style>
   <w:style w:type="table" w:customStyle="1" w:styleId="3">
     <w:name w:val="3"/>
-    <w:basedOn w:val="NormaleTabelle"/>
+    <w:basedOn w:val="TableNormal"/>
     <w:tblPr>
       <w:tblStyleRowBandSize w:val="1"/>
       <w:tblStyleColBandSize w:val="1"/>
-      <w:tblInd w:w="0" w:type="dxa"/>
       <w:tblCellMar>
         <w:top w:w="100" w:type="dxa"/>
         <w:left w:w="100" w:type="dxa"/>
@@ -10332,11 +9928,10 @@
   </w:style>
   <w:style w:type="table" w:customStyle="1" w:styleId="2">
     <w:name w:val="2"/>
-    <w:basedOn w:val="NormaleTabelle"/>
+    <w:basedOn w:val="TableNormal"/>
     <w:tblPr>
       <w:tblStyleRowBandSize w:val="1"/>
       <w:tblStyleColBandSize w:val="1"/>
-      <w:tblInd w:w="0" w:type="dxa"/>
       <w:tblCellMar>
         <w:top w:w="100" w:type="dxa"/>
         <w:left w:w="100" w:type="dxa"/>
@@ -10347,11 +9942,10 @@
   </w:style>
   <w:style w:type="table" w:customStyle="1" w:styleId="1">
     <w:name w:val="1"/>
-    <w:basedOn w:val="NormaleTabelle"/>
+    <w:basedOn w:val="TableNormal"/>
     <w:tblPr>
       <w:tblStyleRowBandSize w:val="1"/>
       <w:tblStyleColBandSize w:val="1"/>
-      <w:tblInd w:w="0" w:type="dxa"/>
       <w:tblCellMar>
         <w:top w:w="100" w:type="dxa"/>
         <w:left w:w="100" w:type="dxa"/>
@@ -10360,10 +9954,10 @@
       </w:tblCellMar>
     </w:tblPr>
   </w:style>
-  <w:style w:type="paragraph" w:styleId="Kommentartext">
+  <w:style w:type="paragraph" w:styleId="CommentText">
     <w:name w:val="annotation text"/>
-    <w:basedOn w:val="Standard"/>
-    <w:link w:val="KommentartextZchn"/>
+    <w:basedOn w:val="Normal"/>
+    <w:link w:val="CommentTextChar"/>
     <w:uiPriority w:val="99"/>
     <w:semiHidden/>
     <w:unhideWhenUsed/>
@@ -10377,10 +9971,10 @@
       <w:lang w:val="en" w:eastAsia="en-US"/>
     </w:rPr>
   </w:style>
-  <w:style w:type="character" w:customStyle="1" w:styleId="KommentartextZchn">
-    <w:name w:val="Kommentartext Zchn"/>
-    <w:basedOn w:val="Absatz-Standardschriftart"/>
-    <w:link w:val="Kommentartext"/>
+  <w:style w:type="character" w:customStyle="1" w:styleId="CommentTextChar">
+    <w:name w:val="Comment Text Char"/>
+    <w:basedOn w:val="DefaultParagraphFont"/>
+    <w:link w:val="CommentText"/>
     <w:uiPriority w:val="99"/>
     <w:semiHidden/>
     <w:rPr>
@@ -10388,9 +9982,9 @@
       <w:szCs w:val="20"/>
     </w:rPr>
   </w:style>
-  <w:style w:type="character" w:styleId="Kommentarzeichen">
+  <w:style w:type="character" w:styleId="CommentReference">
     <w:name w:val="annotation reference"/>
-    <w:basedOn w:val="Absatz-Standardschriftart"/>
+    <w:basedOn w:val="DefaultParagraphFont"/>
     <w:uiPriority w:val="99"/>
     <w:semiHidden/>
     <w:unhideWhenUsed/>
@@ -10399,10 +9993,10 @@
       <w:szCs w:val="16"/>
     </w:rPr>
   </w:style>
-  <w:style w:type="paragraph" w:styleId="Sprechblasentext">
+  <w:style w:type="paragraph" w:styleId="BalloonText">
     <w:name w:val="Balloon Text"/>
-    <w:basedOn w:val="Standard"/>
-    <w:link w:val="SprechblasentextZchn"/>
+    <w:basedOn w:val="Normal"/>
+    <w:link w:val="BalloonTextChar"/>
     <w:uiPriority w:val="99"/>
     <w:semiHidden/>
     <w:unhideWhenUsed/>
@@ -10417,10 +10011,10 @@
       <w:lang w:val="en" w:eastAsia="en-US"/>
     </w:rPr>
   </w:style>
-  <w:style w:type="character" w:customStyle="1" w:styleId="SprechblasentextZchn">
-    <w:name w:val="Sprechblasentext Zchn"/>
-    <w:basedOn w:val="Absatz-Standardschriftart"/>
-    <w:link w:val="Sprechblasentext"/>
+  <w:style w:type="character" w:customStyle="1" w:styleId="BalloonTextChar">
+    <w:name w:val="Balloon Text Char"/>
+    <w:basedOn w:val="DefaultParagraphFont"/>
+    <w:link w:val="BalloonText"/>
     <w:uiPriority w:val="99"/>
     <w:semiHidden/>
     <w:rsid w:val="00515520"/>
@@ -10430,11 +10024,11 @@
       <w:szCs w:val="18"/>
     </w:rPr>
   </w:style>
-  <w:style w:type="paragraph" w:styleId="Kommentarthema">
+  <w:style w:type="paragraph" w:styleId="CommentSubject">
     <w:name w:val="annotation subject"/>
-    <w:basedOn w:val="Kommentartext"/>
-    <w:next w:val="Kommentartext"/>
-    <w:link w:val="KommentarthemaZchn"/>
+    <w:basedOn w:val="CommentText"/>
+    <w:next w:val="CommentText"/>
+    <w:link w:val="CommentSubjectChar"/>
     <w:uiPriority w:val="99"/>
     <w:semiHidden/>
     <w:unhideWhenUsed/>
@@ -10444,10 +10038,10 @@
       <w:bCs/>
     </w:rPr>
   </w:style>
-  <w:style w:type="character" w:customStyle="1" w:styleId="KommentarthemaZchn">
-    <w:name w:val="Kommentarthema Zchn"/>
-    <w:basedOn w:val="KommentartextZchn"/>
-    <w:link w:val="Kommentarthema"/>
+  <w:style w:type="character" w:customStyle="1" w:styleId="CommentSubjectChar">
+    <w:name w:val="Comment Subject Char"/>
+    <w:basedOn w:val="CommentTextChar"/>
+    <w:link w:val="CommentSubject"/>
     <w:uiPriority w:val="99"/>
     <w:semiHidden/>
     <w:rsid w:val="00BC1A8F"/>
@@ -10458,9 +10052,9 @@
       <w:szCs w:val="20"/>
     </w:rPr>
   </w:style>
-  <w:style w:type="character" w:styleId="Link">
+  <w:style w:type="character" w:styleId="Hyperlink">
     <w:name w:val="Hyperlink"/>
-    <w:basedOn w:val="Absatz-Standardschriftart"/>
+    <w:basedOn w:val="DefaultParagraphFont"/>
     <w:uiPriority w:val="99"/>
     <w:unhideWhenUsed/>
     <w:rsid w:val="00B96768"/>
@@ -10471,7 +10065,7 @@
   </w:style>
   <w:style w:type="character" w:customStyle="1" w:styleId="UnresolvedMention1">
     <w:name w:val="Unresolved Mention1"/>
-    <w:basedOn w:val="Absatz-Standardschriftart"/>
+    <w:basedOn w:val="DefaultParagraphFont"/>
     <w:uiPriority w:val="99"/>
     <w:semiHidden/>
     <w:unhideWhenUsed/>
@@ -10481,10 +10075,10 @@
       <w:shd w:val="clear" w:color="auto" w:fill="E6E6E6"/>
     </w:rPr>
   </w:style>
-  <w:style w:type="paragraph" w:styleId="Funotentext">
+  <w:style w:type="paragraph" w:styleId="FootnoteText">
     <w:name w:val="footnote text"/>
-    <w:basedOn w:val="Standard"/>
-    <w:link w:val="FunotentextZchn"/>
+    <w:basedOn w:val="Normal"/>
+    <w:link w:val="FootnoteTextChar"/>
     <w:uiPriority w:val="99"/>
     <w:unhideWhenUsed/>
     <w:rsid w:val="00905389"/>
@@ -10498,10 +10092,10 @@
       <w:lang w:val="en" w:eastAsia="en-US"/>
     </w:rPr>
   </w:style>
-  <w:style w:type="character" w:customStyle="1" w:styleId="FunotentextZchn">
-    <w:name w:val="Fußnotentext Zchn"/>
-    <w:basedOn w:val="Absatz-Standardschriftart"/>
-    <w:link w:val="Funotentext"/>
+  <w:style w:type="character" w:customStyle="1" w:styleId="FootnoteTextChar">
+    <w:name w:val="Footnote Text Char"/>
+    <w:basedOn w:val="DefaultParagraphFont"/>
+    <w:link w:val="FootnoteText"/>
     <w:uiPriority w:val="99"/>
     <w:rsid w:val="00905389"/>
     <w:rPr>
@@ -10509,9 +10103,9 @@
       <w:szCs w:val="20"/>
     </w:rPr>
   </w:style>
-  <w:style w:type="character" w:styleId="Funotenzeichen">
+  <w:style w:type="character" w:styleId="FootnoteReference">
     <w:name w:val="footnote reference"/>
-    <w:basedOn w:val="Absatz-Standardschriftart"/>
+    <w:basedOn w:val="DefaultParagraphFont"/>
     <w:uiPriority w:val="99"/>
     <w:unhideWhenUsed/>
     <w:rsid w:val="00905389"/>
@@ -10519,9 +10113,9 @@
       <w:vertAlign w:val="superscript"/>
     </w:rPr>
   </w:style>
-  <w:style w:type="paragraph" w:styleId="Listenabsatz">
+  <w:style w:type="paragraph" w:styleId="ListParagraph">
     <w:name w:val="List Paragraph"/>
-    <w:basedOn w:val="Standard"/>
+    <w:basedOn w:val="Normal"/>
     <w:uiPriority w:val="34"/>
     <w:qFormat/>
     <w:rsid w:val="0046387E"/>
@@ -10539,7 +10133,7 @@
   </w:style>
   <w:style w:type="paragraph" w:customStyle="1" w:styleId="p1">
     <w:name w:val="p1"/>
-    <w:basedOn w:val="Standard"/>
+    <w:basedOn w:val="Normal"/>
     <w:rsid w:val="00A820DD"/>
     <w:rPr>
       <w:rFonts w:ascii="Helvetica" w:hAnsi="Helvetica"/>
@@ -10547,7 +10141,7 @@
       <w:szCs w:val="18"/>
     </w:rPr>
   </w:style>
-  <w:style w:type="paragraph" w:styleId="berarbeitung">
+  <w:style w:type="paragraph" w:styleId="Revision">
     <w:name w:val="Revision"/>
     <w:hidden/>
     <w:uiPriority w:val="99"/>
@@ -10560,7 +10154,7 @@
   </w:style>
   <w:style w:type="character" w:customStyle="1" w:styleId="UnresolvedMention2">
     <w:name w:val="Unresolved Mention2"/>
-    <w:basedOn w:val="Absatz-Standardschriftart"/>
+    <w:basedOn w:val="DefaultParagraphFont"/>
     <w:uiPriority w:val="99"/>
     <w:rsid w:val="00B7248C"/>
     <w:rPr>
@@ -10568,9 +10162,9 @@
       <w:shd w:val="clear" w:color="auto" w:fill="E6E6E6"/>
     </w:rPr>
   </w:style>
-  <w:style w:type="character" w:styleId="BesuchterLink">
+  <w:style w:type="character" w:styleId="FollowedHyperlink">
     <w:name w:val="FollowedHyperlink"/>
-    <w:basedOn w:val="Absatz-Standardschriftart"/>
+    <w:basedOn w:val="DefaultParagraphFont"/>
     <w:uiPriority w:val="99"/>
     <w:semiHidden/>
     <w:unhideWhenUsed/>
@@ -10580,9 +10174,9 @@
       <w:u w:val="single"/>
     </w:rPr>
   </w:style>
-  <w:style w:type="character" w:styleId="Platzhaltertext">
+  <w:style w:type="character" w:styleId="PlaceholderText">
     <w:name w:val="Placeholder Text"/>
-    <w:basedOn w:val="Absatz-Standardschriftart"/>
+    <w:basedOn w:val="DefaultParagraphFont"/>
     <w:uiPriority w:val="99"/>
     <w:semiHidden/>
     <w:rsid w:val="0024531C"/>
@@ -10590,10 +10184,10 @@
       <w:color w:val="808080"/>
     </w:rPr>
   </w:style>
-  <w:style w:type="paragraph" w:styleId="Dokumentstruktur">
+  <w:style w:type="paragraph" w:styleId="DocumentMap">
     <w:name w:val="Document Map"/>
-    <w:basedOn w:val="Standard"/>
-    <w:link w:val="DokumentstrukturZchn"/>
+    <w:basedOn w:val="Normal"/>
+    <w:link w:val="DocumentMapChar"/>
     <w:uiPriority w:val="99"/>
     <w:semiHidden/>
     <w:unhideWhenUsed/>
@@ -10605,10 +10199,10 @@
       <w:lang w:val="en" w:eastAsia="en-US"/>
     </w:rPr>
   </w:style>
-  <w:style w:type="character" w:customStyle="1" w:styleId="DokumentstrukturZchn">
-    <w:name w:val="Dokumentstruktur Zchn"/>
-    <w:basedOn w:val="Absatz-Standardschriftart"/>
-    <w:link w:val="Dokumentstruktur"/>
+  <w:style w:type="character" w:customStyle="1" w:styleId="DocumentMapChar">
+    <w:name w:val="Document Map Char"/>
+    <w:basedOn w:val="DefaultParagraphFont"/>
+    <w:link w:val="DocumentMap"/>
     <w:uiPriority w:val="99"/>
     <w:semiHidden/>
     <w:rsid w:val="001D311A"/>
@@ -10620,7 +10214,7 @@
   </w:style>
   <w:style w:type="character" w:customStyle="1" w:styleId="UnresolvedMention3">
     <w:name w:val="Unresolved Mention3"/>
-    <w:basedOn w:val="Absatz-Standardschriftart"/>
+    <w:basedOn w:val="DefaultParagraphFont"/>
     <w:uiPriority w:val="99"/>
     <w:rsid w:val="00C46BF3"/>
     <w:rPr>
@@ -10628,9 +10222,9 @@
       <w:shd w:val="clear" w:color="auto" w:fill="E1DFDD"/>
     </w:rPr>
   </w:style>
-  <w:style w:type="paragraph" w:styleId="StandardWeb">
+  <w:style w:type="paragraph" w:styleId="NormalWeb">
     <w:name w:val="Normal (Web)"/>
-    <w:basedOn w:val="Standard"/>
+    <w:basedOn w:val="Normal"/>
     <w:uiPriority w:val="99"/>
     <w:unhideWhenUsed/>
     <w:rsid w:val="00424524"/>
@@ -10640,13 +10234,13 @@
   </w:style>
   <w:style w:type="character" w:customStyle="1" w:styleId="normaltextrun">
     <w:name w:val="normaltextrun"/>
-    <w:basedOn w:val="Absatz-Standardschriftart"/>
+    <w:basedOn w:val="DefaultParagraphFont"/>
     <w:rsid w:val="002E6994"/>
   </w:style>
-  <w:style w:type="paragraph" w:styleId="Kopfzeile">
+  <w:style w:type="paragraph" w:styleId="Header">
     <w:name w:val="header"/>
-    <w:basedOn w:val="Standard"/>
-    <w:link w:val="KopfzeileZchn"/>
+    <w:basedOn w:val="Normal"/>
+    <w:link w:val="HeaderChar"/>
     <w:uiPriority w:val="99"/>
     <w:semiHidden/>
     <w:unhideWhenUsed/>
@@ -10658,10 +10252,10 @@
       </w:tabs>
     </w:pPr>
   </w:style>
-  <w:style w:type="character" w:customStyle="1" w:styleId="KopfzeileZchn">
-    <w:name w:val="Kopfzeile Zchn"/>
-    <w:basedOn w:val="Absatz-Standardschriftart"/>
-    <w:link w:val="Kopfzeile"/>
+  <w:style w:type="character" w:customStyle="1" w:styleId="HeaderChar">
+    <w:name w:val="Header Char"/>
+    <w:basedOn w:val="DefaultParagraphFont"/>
+    <w:link w:val="Header"/>
     <w:uiPriority w:val="99"/>
     <w:semiHidden/>
     <w:rsid w:val="00575C9C"/>
@@ -10672,10 +10266,10 @@
       <w:lang w:val="de-DE" w:eastAsia="de-DE"/>
     </w:rPr>
   </w:style>
-  <w:style w:type="paragraph" w:styleId="Fuzeile">
+  <w:style w:type="paragraph" w:styleId="Footer">
     <w:name w:val="footer"/>
-    <w:basedOn w:val="Standard"/>
-    <w:link w:val="FuzeileZchn"/>
+    <w:basedOn w:val="Normal"/>
+    <w:link w:val="FooterChar"/>
     <w:uiPriority w:val="99"/>
     <w:semiHidden/>
     <w:unhideWhenUsed/>
@@ -10687,10 +10281,10 @@
       </w:tabs>
     </w:pPr>
   </w:style>
-  <w:style w:type="character" w:customStyle="1" w:styleId="FuzeileZchn">
-    <w:name w:val="Fußzeile Zchn"/>
-    <w:basedOn w:val="Absatz-Standardschriftart"/>
-    <w:link w:val="Fuzeile"/>
+  <w:style w:type="character" w:customStyle="1" w:styleId="FooterChar">
+    <w:name w:val="Footer Char"/>
+    <w:basedOn w:val="DefaultParagraphFont"/>
+    <w:link w:val="Footer"/>
     <w:uiPriority w:val="99"/>
     <w:semiHidden/>
     <w:rsid w:val="00575C9C"/>

</xml_diff>